<commit_message>
Add the task-closed section to the V4 to V7 summary and rebuild the archive
The summary already carried the two instruction-only clarifications. It now
also records that the synchronization task is closed, that no further script,
thumbnail, deck, routing or asset change follows unless a real defect is found,
and that the V8 to V13 draft batch is a separate task.

Videos_4-7_Sep09_COMPLETE_Handoff.zip rebuilt around the updated summary, and
the tracker checksum refreshed. No package file changed.

Co-Authored-By: Claude Opus 5 <noreply@anthropic.com>
Claude-Session: https://claude.ai/code/session_01Wfc5h2Ht6AtYuBtWnTpxfs
</commit_message>
<xml_diff>
--- a/deliverables/V4-V7_Sep09_Synchronization_Summary.docx
+++ b/deliverables/V4-V7_Sep09_Synchronization_Summary.docx
@@ -2120,6 +2120,61 @@
     </w:p>
     <w:p>
       <w:pPr>
+        <w:spacing w:before="320" w:after="120"/>
+        <w:keepNext w:val="1"/>
+        <w:keepLines w:val="1"/>
+      </w:pPr>
+      <w:r>
+        <w:rPr>
+          <w:b/>
+          <w:i w:val="0"/>
+          <w:color w:val="112345"/>
+          <w:sz w:val="26"/>
+        </w:rPr>
+        <w:t>12. TASK CLOSED</w:t>
+      </w:r>
+    </w:p>
+    <w:p>
+      <w:pPr>
+        <w:spacing w:before="0" w:after="160"/>
+      </w:pPr>
+      <w:r>
+        <w:rPr>
+          <w:b w:val="0"/>
+          <w:i w:val="0"/>
+          <w:sz w:val="22"/>
+        </w:rPr>
+        <w:t>You accepted the September 9 synchronization and the targeted asset updates, and the two instruction-only clarifications were the final item. The Videos 4 to 7 synchronization task is closed in the tracker.</w:t>
+      </w:r>
+    </w:p>
+    <w:p>
+      <w:pPr>
+        <w:spacing w:before="0" w:after="160"/>
+      </w:pPr>
+      <w:r>
+        <w:rPr>
+          <w:b w:val="0"/>
+          <w:i w:val="0"/>
+          <w:sz w:val="22"/>
+        </w:rPr>
+        <w:t>No further script, thumbnail, deck, routing or asset change for Videos 4 to 7 unless an actual factual or production defect is found.</w:t>
+      </w:r>
+    </w:p>
+    <w:p>
+      <w:pPr>
+        <w:spacing w:before="0" w:after="160"/>
+      </w:pPr>
+      <w:r>
+        <w:rPr>
+          <w:b w:val="0"/>
+          <w:i w:val="0"/>
+          <w:sz w:val="22"/>
+        </w:rPr>
+        <w:t>The V8 to V13 draft batch is a separate task and shares nothing with this one.</w:t>
+      </w:r>
+    </w:p>
+    <w:p>
+      <w:pPr>
         <w:spacing w:before="0" w:after="240"/>
         <w:pBdr>
           <w:bottom w:val="single" w:sz="6" w:color="8A6D1E"/>
@@ -2137,7 +2192,7 @@
           <w:color w:val="112345"/>
           <w:sz w:val="24"/>
         </w:rPr>
-        <w:t>VIDEOS 4, 5, 6 AND 7: PACKAGES SYNCHRONIZED TO THE SEPTEMBER 9 SCRIPT LOCK.</w:t>
+        <w:t>VIDEOS 4, 5, 6 AND 7: PACKAGES SYNCHRONIZED TO THE SEPTEMBER 9 SCRIPT LOCK. TASK CLOSED.</w:t>
       </w:r>
     </w:p>
     <w:p>

</xml_diff>